<commit_message>
Step 3: correct hotspot summary caption text to match renamed column
Co-Authored-By: Claude Sonnet 5 <noreply@anthropic.com>
</commit_message>
<xml_diff>
--- a/inst/captions/hotspot_summary_caption.docx
+++ b/inst/captions/hotspot_summary_caption.docx
@@ -27,39 +27,7 @@
           <w:sz w:val="20"/>
           <w:szCs w:val="20"/>
         </w:rPr>
-        <w:t xml:space="preserve">. The left map shows the per-cell Theil-Sen suitability trend restricted to states </w:t>
-      </w:r>
-      <w:r>
-        <w:rPr>
-          <w:rFonts w:ascii="Calibri" w:hAnsi="Calibri" w:cs="Calibri"/>
-          <w:sz w:val="20"/>
-          <w:szCs w:val="20"/>
-        </w:rPr>
-        <w:t>encompassing</w:t>
-      </w:r>
-      <w:r>
-        <w:rPr>
-          <w:rFonts w:ascii="Calibri" w:hAnsi="Calibri" w:cs="Calibri"/>
-          <w:sz w:val="20"/>
-          <w:szCs w:val="20"/>
-        </w:rPr>
-        <w:t xml:space="preserve"> </w:t>
-      </w:r>
-      <w:r>
-        <w:rPr>
-          <w:rFonts w:ascii="Calibri" w:hAnsi="Calibri" w:cs="Calibri"/>
-          <w:sz w:val="20"/>
-          <w:szCs w:val="20"/>
-        </w:rPr>
-        <w:t xml:space="preserve">the highest percentages of </w:t>
-      </w:r>
-      <w:r>
-        <w:rPr>
-          <w:rFonts w:ascii="Calibri" w:hAnsi="Calibri" w:cs="Calibri"/>
-          <w:sz w:val="20"/>
-          <w:szCs w:val="20"/>
-        </w:rPr>
-        <w:t>the species' USGS GAP range. Green indicates increasing suitability; red indicates decreasing suitability. The right map shows hotspots of accelerating suitability decline within those same states; orange cells are areas where the rate of suitability loss is itself increasing. The table reports, for each state, total state area, GAP range area and percentage, the proportions of range cells with positive and negative trends, hotspot area, and hotspot percentage of range area. All areas in km².</w:t>
+        <w:t xml:space="preserve">. The left map shows the per-cell Theil-Sen suitability trend restricted to states encompassing the highest percentages of the species' USGS GAP range. Green indicates increasing suitability; red indicates decreasing suitability. The right map shows hotspots of accelerating suitability decline within those same states; orange cells are areas where the rate of suitability loss is itself increasing. The table reports, for each state, the portion of the state's area within the species' modeled extent, GAP range area and percentage, the proportions of range cells with positive and negative trends, hotspot area, and hotspot percentage of range area. All areas in km².</w:t>
       </w:r>
     </w:p>
     <w:sectPr>

</xml_diff>